<commit_message>
JARVIS 4.0: Consolidacion completa - Anadido backup.ps1, restaurado lanzador, actualizados manuales, setup y readme con soporte AND logical y persistencia de DLCs
</commit_message>
<xml_diff>
--- a/Manual_Usuario_JARVIS.docx
+++ b/Manual_Usuario_JARVIS.docx
@@ -73,6 +73,14 @@
       <w:r>
         <w:t>Escaneo de Documentos: Capacidad para digitalizar hojas de forma interactiva usando tu escÃ¡ner fÃ­sico, compilar mÃºltiples pÃ¡ginas en un Ãºnico PDF y abrirlo automÃ¡ticamente en Acrobat Pro.</w:t>
       </w:r>
+    </w:p>
+    <w:p>
+      <w:pPr>
+        <w:pStyle w:val="Listaconvietas"/>
+      </w:pPr>
+      <w:r>
+        <w:t>Escaneo de Documentos: Capacidad para digitalizar hojas de forma interactiva usando tu escÃ¡ner fÃ­sico, compilar mÃºltiples pÃ¡ginas en un Ãºnico PDF y abrirlo automÃ¡ticamente en Acrobat Pro.</w:t>
+      </w:r>
       <w:r>
         <w:t>Interacción web/App: Puede abrir aplicaciones locales instaladas y lanzar URLs en tu navegador.</w:t>
       </w:r>
@@ -89,6 +97,38 @@
       <w:pPr>
         <w:pStyle w:val="Ttulo1"/>
       </w:pPr>
+    </w:p>
+    <w:p>
+      <w:pPr>
+        <w:pStyle w:val="Ttulo1"/>
+      </w:pPr>
+      <w:r>
+        <w:t>BÃºsqueda local multi-palabra (AND): El buscador de archivos (Buscar-Archivo.ps1) ahora permite buscar tÃ©rminos en cualquier orden (ej: 'control compras' encontrarÃ¡ 'Control de compras').</w:t>
+      </w:r>
+    </w:p>
+    <w:p>
+      <w:pPr>
+        <w:pStyle w:val="Ttulo1"/>
+      </w:pPr>
+      <w:r>
+        <w:t>Persistencia real de DLCs: Los interruptores de Memoria Vectorial, Clicky (VisiÃ³n) y YouTube en el panel lateral se guardan permanentemente en config.yaml.</w:t>
+      </w:r>
+    </w:p>
+    <w:p>
+      <w:pPr>
+        <w:pStyle w:val="Ttulo1"/>
+      </w:pPr>
+      <w:r>
+        <w:t>Enrutamiento HÃ­brido (MoE): Jarvis conmuta automÃ¡ticamente al cerebro de la nube (usando gemini-3.5-flash) para tareas complejas o lectura visual, optimizando cuotas y rapidez.</w:t>
+      </w:r>
+    </w:p>
+    <w:p>
+      <w:pPr>
+        <w:pStyle w:val="Ttulo1"/>
+      </w:pPr>
+      <w:r>
+        <w:t>MensajerÃ­a Limpia: Cuando 'Mostrar Pensamiento' estÃ¡ desactivado, el chat oculta el cÃ³digo tÃ©cnico y los razonamientos intermedios, ofreciendo una conversaciÃ³n limpia.</w:t>
+      </w:r>
       <w:r>
         <w:t>2. ¿Qué puedes pedirle en el día a día?</w:t>
       </w:r>
@@ -133,7 +173,16 @@
         <w:t>3. ¿Qué puedes esperar? (Límites de Arquitectura)</w:t>
       </w:r>
     </w:p>
+    <w:p/>
     <w:p>
+      <w:r>
+        <w:t>BÃºsqueda inteligente AND: "Jarvis, busca la carpeta compras de control".</w:t>
+      </w:r>
+    </w:p>
+    <w:p>
+      <w:r>
+        <w:t>Charla silenciosa: Desactiva 'Mostrar Pensamiento' para una interacciÃ³n directa y limpia.</w:t>
+      </w:r>
       <w:r>
         <w:t>Limitación de Parámetros: JARVIS corre en local sobre un modelo de 7B parámetros. Es rápido y privado, pero su capacidad lógica es inferior a modelos Cloud gigantes.</w:t>
       </w:r>
@@ -143,6 +192,7 @@
         <w:pStyle w:val="Listaconvietas"/>
       </w:pPr>
       <w:r>
+        <w:lastRenderedPageBreak/>
         <w:t>Programación desde cero: Si le pides código complejo o estructuras desde cero sin un marco de referencia, es propenso a inventarse comandos o sintaxis. Para programar a bajo nivel, es mejor usar a la IA de desarrollo (Antigravity).</w:t>
       </w:r>
     </w:p>

</xml_diff>

<commit_message>
Documentación: Actualizar README.md y compilar Manual_Usuario_JARVIS (DOCX y PDF) con la arquitectura MoE y novedades de robustez de la v4.0
</commit_message>
<xml_diff>
--- a/Manual_Usuario_JARVIS.docx
+++ b/Manual_Usuario_JARVIS.docx
@@ -81,6 +81,14 @@
       <w:r>
         <w:t>Escaneo de Documentos: Capacidad para digitalizar hojas de forma interactiva usando tu escÃ¡ner fÃ­sico, compilar mÃºltiples pÃ¡ginas en un Ãºnico PDF y abrirlo automÃ¡ticamente en Acrobat Pro.</w:t>
       </w:r>
+    </w:p>
+    <w:p>
+      <w:pPr>
+        <w:pStyle w:val="Listaconvietas"/>
+      </w:pPr>
+      <w:r>
+        <w:t>Escaneo de Documentos: Capacidad para digitalizar hojas de forma interactiva usando tu escÃ¡ner fÃ­sico, compilar mÃºltiples pÃ¡ginas en un Ãºnico PDF y abrirlo automÃ¡ticamente en Acrobat Pro.</w:t>
+      </w:r>
       <w:r>
         <w:t>Interacción web/App: Puede abrir aplicaciones locales instaladas y lanzar URLs en tu navegador.</w:t>
       </w:r>
@@ -97,6 +105,38 @@
       <w:pPr>
         <w:pStyle w:val="Ttulo1"/>
       </w:pPr>
+    </w:p>
+    <w:p>
+      <w:pPr>
+        <w:pStyle w:val="Ttulo1"/>
+      </w:pPr>
+      <w:r>
+        <w:t>BÃºsqueda local multi-palabra (AND): El buscador de archivos (Buscar-Archivo.ps1) ahora permite buscar tÃ©rminos en cualquier orden (ej: 'control compras' encontrarÃ¡ 'Control de compras').</w:t>
+      </w:r>
+    </w:p>
+    <w:p>
+      <w:pPr>
+        <w:pStyle w:val="Ttulo1"/>
+      </w:pPr>
+      <w:r>
+        <w:t>Persistencia real de DLCs: Los interruptores de Memoria Vectorial, Clicky (VisiÃ³n) y YouTube en el panel lateral se guardan permanentemente en config.yaml.</w:t>
+      </w:r>
+    </w:p>
+    <w:p>
+      <w:pPr>
+        <w:pStyle w:val="Ttulo1"/>
+      </w:pPr>
+      <w:r>
+        <w:t>Enrutamiento HÃ­brido (MoE): Jarvis conmuta automÃ¡ticamente al cerebro de la nube (usando gemini-3.5-flash) para tareas complejas o lectura visual, optimizando cuotas y rapidez.</w:t>
+      </w:r>
+    </w:p>
+    <w:p>
+      <w:pPr>
+        <w:pStyle w:val="Ttulo1"/>
+      </w:pPr>
+      <w:r>
+        <w:t>MensajerÃ­a Limpia: Cuando 'Mostrar Pensamiento' estÃ¡ desactivado, el chat oculta el cÃ³digo tÃ©cnico y los razonamientos intermedios, ofreciendo una conversaciÃ³n limpia.</w:t>
+      </w:r>
     </w:p>
     <w:p>
       <w:pPr>
@@ -174,6 +214,16 @@
       </w:r>
     </w:p>
     <w:p/>
+    <w:p>
+      <w:r>
+        <w:t>BÃºsqueda inteligente AND: "Jarvis, busca la carpeta compras de control".</w:t>
+      </w:r>
+    </w:p>
+    <w:p>
+      <w:r>
+        <w:t>Charla silenciosa: Desactiva 'Mostrar Pensamiento' para una interacciÃ³n directa y limpia.</w:t>
+      </w:r>
+    </w:p>
     <w:p>
       <w:r>
         <w:t>BÃºsqueda inteligente AND: "Jarvis, busca la carpeta compras de control".</w:t>

</xml_diff>

<commit_message>
Docs: actualizar README y manual PDF/DOCX con mejoras de vision y fallback OCR
</commit_message>
<xml_diff>
--- a/Manual_Usuario_JARVIS.docx
+++ b/Manual_Usuario_JARVIS.docx
@@ -65,6 +65,14 @@
       <w:pPr>
         <w:pStyle w:val="Listaconvietas"/>
       </w:pPr>
+    </w:p>
+    <w:p>
+      <w:pPr>
+        <w:pStyle w:val="Listaconvietas"/>
+      </w:pPr>
+      <w:r>
+        <w:t>Escaneo de Documentos: Capacidad para digitalizar hojas de forma interactiva usando tu escÃ¡ner fÃ­sico, compilar mÃºltiples pÃ¡ginas en un Ãºnico PDF y abrirlo automÃ¡ticamente en Acrobat Pro.</w:t>
+      </w:r>
     </w:p>
     <w:p>
       <w:pPr>
@@ -169,6 +177,39 @@
       <w:r>
         <w:t>MensajerÃ­a Limpia: Cuando 'Mostrar Pensamiento' estÃ¡ desactivado, el chat oculta el cÃ³digo tÃ©cnico y los razonamientos intermedios, ofreciendo una conversaciÃ³n limpia.</w:t>
       </w:r>
+    </w:p>
+    <w:p>
+      <w:pPr>
+        <w:pStyle w:val="Ttulo1"/>
+      </w:pPr>
+      <w:r>
+        <w:t>BÃºsqueda local multi-palabra (AND): El buscador de archivos (Buscar-Archivo.ps1) ahora permite buscar tÃ©rminos en cualquier orden (ej: 'control compras' encontrarÃ¡ 'Control de compras').</w:t>
+      </w:r>
+    </w:p>
+    <w:p>
+      <w:pPr>
+        <w:pStyle w:val="Ttulo1"/>
+      </w:pPr>
+      <w:r>
+        <w:t>Persistencia real de DLCs: Los interruptores de Memoria Vectorial, Clicky (VisiÃ³n) y YouTube en el panel lateral se guardan permanentemente en config.yaml.</w:t>
+      </w:r>
+    </w:p>
+    <w:p>
+      <w:pPr>
+        <w:pStyle w:val="Ttulo1"/>
+      </w:pPr>
+      <w:r>
+        <w:t>Enrutamiento HÃ­brido (MoE): Jarvis conmuta automÃ¡ticamente al cerebro de la nube (usando gemini-3.5-flash) para tareas complejas o lectura visual, optimizando cuotas y rapidez.</w:t>
+      </w:r>
+    </w:p>
+    <w:p>
+      <w:pPr>
+        <w:pStyle w:val="Ttulo1"/>
+      </w:pPr>
+      <w:r>
+        <w:lastRenderedPageBreak/>
+        <w:t>MensajerÃ­a Limpia: Cuando 'Mostrar Pensamiento' estÃ¡ desactivado, el chat oculta el cÃ³digo tÃ©cnico y los razonamientos intermedios, ofreciendo una conversaciÃ³n limpia.</w:t>
+      </w:r>
       <w:r>
         <w:t>2. ¿Qué puedes pedirle en el día a día?</w:t>
       </w:r>
@@ -233,6 +274,16 @@
       <w:r>
         <w:t>Charla silenciosa: Desactiva 'Mostrar Pensamiento' para una interacciÃ³n directa y limpia.</w:t>
       </w:r>
+    </w:p>
+    <w:p>
+      <w:r>
+        <w:t>BÃºsqueda inteligente AND: "Jarvis, busca la carpeta compras de control".</w:t>
+      </w:r>
+    </w:p>
+    <w:p>
+      <w:r>
+        <w:t>Charla silenciosa: Desactiva 'Mostrar Pensamiento' para una interacciÃ³n directa y limpia.</w:t>
+      </w:r>
       <w:r>
         <w:t>Limitación de Parámetros: JARVIS corre en local sobre un modelo de 7B parámetros. Es rápido y privado, pero su capacidad lógica es inferior a modelos Cloud gigantes.</w:t>
       </w:r>
@@ -242,7 +293,6 @@
         <w:pStyle w:val="Listaconvietas"/>
       </w:pPr>
       <w:r>
-        <w:lastRenderedPageBreak/>
         <w:t>Programación desde cero: Si le pides código complejo o estructuras desde cero sin un marco de referencia, es propenso a inventarse comandos o sintaxis. Para programar a bajo nivel, es mejor usar a la IA de desarrollo (Antigravity).</w:t>
       </w:r>
     </w:p>

</xml_diff>

<commit_message>
Docs: actualizar manual PDF/DOCX con reglas de manipulacion de CSV/Excel
</commit_message>
<xml_diff>
--- a/Manual_Usuario_JARVIS.docx
+++ b/Manual_Usuario_JARVIS.docx
@@ -65,6 +65,14 @@
       <w:pPr>
         <w:pStyle w:val="Listaconvietas"/>
       </w:pPr>
+    </w:p>
+    <w:p>
+      <w:pPr>
+        <w:pStyle w:val="Listaconvietas"/>
+      </w:pPr>
+      <w:r>
+        <w:t>Escaneo de Documentos: Capacidad para digitalizar hojas de forma interactiva usando tu escÃ¡ner fÃ­sico, compilar mÃºltiples pÃ¡ginas en un Ãºnico PDF y abrirlo automÃ¡ticamente en Acrobat Pro.</w:t>
+      </w:r>
     </w:p>
     <w:p>
       <w:pPr>
@@ -210,6 +218,38 @@
         <w:lastRenderedPageBreak/>
         <w:t>MensajerÃ­a Limpia: Cuando 'Mostrar Pensamiento' estÃ¡ desactivado, el chat oculta el cÃ³digo tÃ©cnico y los razonamientos intermedios, ofreciendo una conversaciÃ³n limpia.</w:t>
       </w:r>
+    </w:p>
+    <w:p>
+      <w:pPr>
+        <w:pStyle w:val="Ttulo1"/>
+      </w:pPr>
+      <w:r>
+        <w:t>BÃºsqueda local multi-palabra (AND): El buscador de archivos (Buscar-Archivo.ps1) ahora permite buscar tÃ©rminos en cualquier orden (ej: 'control compras' encontrarÃ¡ 'Control de compras').</w:t>
+      </w:r>
+    </w:p>
+    <w:p>
+      <w:pPr>
+        <w:pStyle w:val="Ttulo1"/>
+      </w:pPr>
+      <w:r>
+        <w:t>Persistencia real de DLCs: Los interruptores de Memoria Vectorial, Clicky (VisiÃ³n) y YouTube en el panel lateral se guardan permanentemente en config.yaml.</w:t>
+      </w:r>
+    </w:p>
+    <w:p>
+      <w:pPr>
+        <w:pStyle w:val="Ttulo1"/>
+      </w:pPr>
+      <w:r>
+        <w:t>Enrutamiento HÃ­brido (MoE): Jarvis conmuta automÃ¡ticamente al cerebro de la nube (usando gemini-3.5-flash) para tareas complejas o lectura visual, optimizando cuotas y rapidez.</w:t>
+      </w:r>
+    </w:p>
+    <w:p>
+      <w:pPr>
+        <w:pStyle w:val="Ttulo1"/>
+      </w:pPr>
+      <w:r>
+        <w:t>MensajerÃ­a Limpia: Cuando 'Mostrar Pensamiento' estÃ¡ desactivado, el chat oculta el cÃ³digo tÃ©cnico y los razonamientos intermedios, ofreciendo una conversaciÃ³n limpia.</w:t>
+      </w:r>
       <w:r>
         <w:t>2. ¿Qué puedes pedirle en el día a día?</w:t>
       </w:r>
@@ -255,6 +295,16 @@
       </w:r>
     </w:p>
     <w:p/>
+    <w:p>
+      <w:r>
+        <w:t>BÃºsqueda inteligente AND: "Jarvis, busca la carpeta compras de control".</w:t>
+      </w:r>
+    </w:p>
+    <w:p>
+      <w:r>
+        <w:t>Charla silenciosa: Desactiva 'Mostrar Pensamiento' para una interacciÃ³n directa y limpia.</w:t>
+      </w:r>
+    </w:p>
     <w:p>
       <w:r>
         <w:t>BÃºsqueda inteligente AND: "Jarvis, busca la carpeta compras de control".</w:t>

</xml_diff>

<commit_message>
Docs: actualizar manual PDF/DOCX con protocolo de auto-diagnostico y timeouts
</commit_message>
<xml_diff>
--- a/Manual_Usuario_JARVIS.docx
+++ b/Manual_Usuario_JARVIS.docx
@@ -65,6 +65,14 @@
       <w:pPr>
         <w:pStyle w:val="Listaconvietas"/>
       </w:pPr>
+    </w:p>
+    <w:p>
+      <w:pPr>
+        <w:pStyle w:val="Listaconvietas"/>
+      </w:pPr>
+      <w:r>
+        <w:t>Escaneo de Documentos: Capacidad para digitalizar hojas de forma interactiva usando tu escÃ¡ner fÃ­sico, compilar mÃºltiples pÃ¡ginas en un Ãºnico PDF y abrirlo automÃ¡ticamente en Acrobat Pro.</w:t>
+      </w:r>
     </w:p>
     <w:p>
       <w:pPr>
@@ -250,6 +258,38 @@
       <w:r>
         <w:t>MensajerÃ­a Limpia: Cuando 'Mostrar Pensamiento' estÃ¡ desactivado, el chat oculta el cÃ³digo tÃ©cnico y los razonamientos intermedios, ofreciendo una conversaciÃ³n limpia.</w:t>
       </w:r>
+    </w:p>
+    <w:p>
+      <w:pPr>
+        <w:pStyle w:val="Ttulo1"/>
+      </w:pPr>
+      <w:r>
+        <w:t>BÃºsqueda local multi-palabra (AND): El buscador de archivos (Buscar-Archivo.ps1) ahora permite buscar tÃ©rminos en cualquier orden (ej: 'control compras' encontrarÃ¡ 'Control de compras').</w:t>
+      </w:r>
+    </w:p>
+    <w:p>
+      <w:pPr>
+        <w:pStyle w:val="Ttulo1"/>
+      </w:pPr>
+      <w:r>
+        <w:t>Persistencia real de DLCs: Los interruptores de Memoria Vectorial, Clicky (VisiÃ³n) y YouTube en el panel lateral se guardan permanentemente en config.yaml.</w:t>
+      </w:r>
+    </w:p>
+    <w:p>
+      <w:pPr>
+        <w:pStyle w:val="Ttulo1"/>
+      </w:pPr>
+      <w:r>
+        <w:t>Enrutamiento HÃ­brido (MoE): Jarvis conmuta automÃ¡ticamente al cerebro de la nube (usando gemini-3.5-flash) para tareas complejas o lectura visual, optimizando cuotas y rapidez.</w:t>
+      </w:r>
+    </w:p>
+    <w:p>
+      <w:pPr>
+        <w:pStyle w:val="Ttulo1"/>
+      </w:pPr>
+      <w:r>
+        <w:t>MensajerÃ­a Limpia: Cuando 'Mostrar Pensamiento' estÃ¡ desactivado, el chat oculta el cÃ³digo tÃ©cnico y los razonamientos intermedios, ofreciendo una conversaciÃ³n limpia.</w:t>
+      </w:r>
       <w:r>
         <w:t>2. ¿Qué puedes pedirle en el día a día?</w:t>
       </w:r>
@@ -295,6 +335,16 @@
       </w:r>
     </w:p>
     <w:p/>
+    <w:p>
+      <w:r>
+        <w:t>BÃºsqueda inteligente AND: "Jarvis, busca la carpeta compras de control".</w:t>
+      </w:r>
+    </w:p>
+    <w:p>
+      <w:r>
+        <w:t>Charla silenciosa: Desactiva 'Mostrar Pensamiento' para una interacciÃ³n directa y limpia.</w:t>
+      </w:r>
+    </w:p>
     <w:p>
       <w:r>
         <w:t>BÃºsqueda inteligente AND: "Jarvis, busca la carpeta compras de control".</w:t>

</xml_diff>